<commit_message>
Deploying to gh-pages from @ Morrison-Lab/mds@5427afdf15ae34fa1198017454d676825748cfcd 🚀
</commit_message>
<xml_diff>
--- a/vector-calculus.docx
+++ b/vector-calculus.docx
@@ -15,7 +15,7 @@
         <w:pStyle w:val="Date"/>
       </w:pPr>
       <w:r>
-        <w:t xml:space="preserve">Last modified: 2026-09-28 03:37:09 (PDT)</w:t>
+        <w:t xml:space="preserve">Last modified: 2026-09-28 05:02:54 (PDT)</w:t>
       </w:r>
     </w:p>
     <w:p>
@@ -24756,7 +24756,7 @@
       </w:r>
     </w:p>
     <w:bookmarkEnd w:id="48"/>
-    <w:bookmarkStart w:id="49" w:name="def-trace"/>
+    <w:bookmarkStart w:id="49" w:name="def-matrix-derivative"/>
     <w:p>
       <w:pPr>
         <w:pStyle w:val="BodyText"/>
@@ -24766,346 +24766,7 @@
           <w:b/>
           <w:bCs/>
         </w:rPr>
-        <w:t xml:space="preserve">Definition 5 (Trace)</w:t>
-      </w:r>
-      <w:r>
-        <w:t xml:space="preserve"> </w:t>
-      </w:r>
-      <w:r>
-        <w:t xml:space="preserve">The</w:t>
-      </w:r>
-      <w:r>
-        <w:t xml:space="preserve"> </w:t>
-      </w:r>
-      <w:r>
-        <w:rPr>
-          <w:b/>
-          <w:bCs/>
-        </w:rPr>
-        <w:t xml:space="preserve">trace</w:t>
-      </w:r>
-      <w:r>
-        <w:t xml:space="preserve"> </w:t>
-      </w:r>
-      <w:r>
-        <w:t xml:space="preserve">of a</w:t>
-      </w:r>
-      <w:r>
-        <w:t xml:space="preserve"> </w:t>
-      </w:r>
-      <m:oMath>
-        <m:r>
-          <m:t>p</m:t>
-        </m:r>
-        <m:r>
-          <m:rPr>
-            <m:sty m:val="p"/>
-          </m:rPr>
-          <m:t>×</m:t>
-        </m:r>
-        <m:r>
-          <m:t>p</m:t>
-        </m:r>
-      </m:oMath>
-      <w:r>
-        <w:t xml:space="preserve"> </w:t>
-      </w:r>
-      <w:r>
-        <w:t xml:space="preserve">matrix</w:t>
-      </w:r>
-      <w:r>
-        <w:t xml:space="preserve"> </w:t>
-      </w:r>
-      <m:oMath>
-        <m:r>
-          <m:rPr>
-            <m:sty m:val="bi"/>
-          </m:rPr>
-          <m:t>M</m:t>
-        </m:r>
-      </m:oMath>
-      <w:r>
-        <w:t xml:space="preserve"> </w:t>
-      </w:r>
-      <w:r>
-        <w:t xml:space="preserve">is the sum of its diagonal entries:</w:t>
-      </w:r>
-    </w:p>
-    <w:p>
-      <w:pPr>
-        <w:pStyle w:val="BodyText"/>
-      </w:pPr>
-      <m:oMathPara>
-        <m:oMathParaPr>
-          <m:jc m:val="center"/>
-        </m:oMathParaPr>
-        <m:oMath>
-          <m:r>
-            <m:rPr>
-              <m:sty m:val="p"/>
-            </m:rPr>
-            <m:t>tr</m:t>
-          </m:r>
-          <m:r>
-            <m:rPr>
-              <m:sty m:val="p"/>
-            </m:rPr>
-            <m:t>(</m:t>
-          </m:r>
-          <m:r>
-            <m:rPr>
-              <m:sty m:val="bi"/>
-            </m:rPr>
-            <m:t>M</m:t>
-          </m:r>
-          <m:r>
-            <m:rPr>
-              <m:sty m:val="p"/>
-            </m:rPr>
-            <m:t>)</m:t>
-          </m:r>
-          <m:limUpp>
-            <m:e>
-              <m:r>
-                <m:rPr>
-                  <m:sty m:val="p"/>
-                </m:rPr>
-                <m:t>=</m:t>
-              </m:r>
-            </m:e>
-            <m:lim>
-              <m:r>
-                <m:rPr>
-                  <m:nor/>
-                  <m:sty m:val="p"/>
-                </m:rPr>
-                <m:t>def</m:t>
-              </m:r>
-            </m:lim>
-          </m:limUpp>
-          <m:nary>
-            <m:naryPr>
-              <m:chr m:val="∑"/>
-              <m:limLoc m:val="undOvr"/>
-              <m:subHide m:val="off"/>
-              <m:supHide m:val="off"/>
-            </m:naryPr>
-            <m:sub>
-              <m:r>
-                <m:t>i</m:t>
-              </m:r>
-              <m:r>
-                <m:rPr>
-                  <m:sty m:val="p"/>
-                </m:rPr>
-                <m:t>=</m:t>
-              </m:r>
-              <m:r>
-                <m:t>1</m:t>
-              </m:r>
-            </m:sub>
-            <m:sup>
-              <m:r>
-                <m:t>p</m:t>
-              </m:r>
-            </m:sup>
-            <m:e>
-              <m:sSub>
-                <m:e>
-                  <m:r>
-                    <m:t>M</m:t>
-                  </m:r>
-                </m:e>
-                <m:sub>
-                  <m:r>
-                    <m:t>i</m:t>
-                  </m:r>
-                  <m:r>
-                    <m:t>i</m:t>
-                  </m:r>
-                </m:sub>
-              </m:sSub>
-            </m:e>
-          </m:nary>
-        </m:oMath>
-      </m:oMathPara>
-    </w:p>
-    <w:bookmarkEnd w:id="49"/>
-    <w:bookmarkStart w:id="50" w:name="exm-trace"/>
-    <w:p>
-      <w:pPr>
-        <w:pStyle w:val="FirstParagraph"/>
-      </w:pPr>
-      <w:r>
-        <w:rPr>
-          <w:b/>
-          <w:bCs/>
-        </w:rPr>
-        <w:t xml:space="preserve">Example 13 (The trace of a</w:t>
-      </w:r>
-      <w:r>
-        <w:rPr>
-          <w:b/>
-          <w:bCs/>
-        </w:rPr>
-        <w:t xml:space="preserve"> </w:t>
-      </w:r>
-      <m:oMath>
-        <m:r>
-          <m:t>2</m:t>
-        </m:r>
-        <m:r>
-          <m:rPr>
-            <m:sty m:val="p"/>
-          </m:rPr>
-          <m:t>×</m:t>
-        </m:r>
-        <m:r>
-          <m:t>2</m:t>
-        </m:r>
-      </m:oMath>
-      <w:r>
-        <w:rPr>
-          <w:b/>
-          <w:bCs/>
-        </w:rPr>
-        <w:t xml:space="preserve"> </w:t>
-      </w:r>
-      <w:r>
-        <w:rPr>
-          <w:b/>
-          <w:bCs/>
-        </w:rPr>
-        <w:t xml:space="preserve">matrix)</w:t>
-      </w:r>
-    </w:p>
-    <w:p>
-      <w:pPr>
-        <w:pStyle w:val="BodyText"/>
-      </w:pPr>
-      <m:oMathPara>
-        <m:oMathParaPr>
-          <m:jc m:val="center"/>
-        </m:oMathParaPr>
-        <m:oMath>
-          <m:r>
-            <m:rPr>
-              <m:sty m:val="p"/>
-            </m:rPr>
-            <m:t>tr</m:t>
-          </m:r>
-          <m:r>
-            <m:t>​</m:t>
-          </m:r>
-          <m:d>
-            <m:dPr>
-              <m:begChr m:val="("/>
-              <m:sepChr m:val=""/>
-              <m:endChr m:val=")"/>
-              <m:grow/>
-            </m:dPr>
-            <m:e>
-              <m:d>
-                <m:dPr>
-                  <m:begChr m:val="["/>
-                  <m:sepChr m:val=""/>
-                  <m:endChr m:val="]"/>
-                  <m:grow/>
-                </m:dPr>
-                <m:e>
-                  <m:m>
-                    <m:mPr>
-                      <m:baseJc m:val="center"/>
-                      <m:plcHide m:val="on"/>
-                      <m:mcs>
-                        <m:mc>
-                          <m:mcPr>
-                            <m:mcJc m:val="center"/>
-                            <m:count m:val="1"/>
-                          </m:mcPr>
-                        </m:mc>
-                        <m:mc>
-                          <m:mcPr>
-                            <m:mcJc m:val="center"/>
-                            <m:count m:val="1"/>
-                          </m:mcPr>
-                        </m:mc>
-                      </m:mcs>
-                    </m:mPr>
-                    <m:mr>
-                      <m:e>
-                        <m:r>
-                          <m:t>1</m:t>
-                        </m:r>
-                      </m:e>
-                      <m:e>
-                        <m:r>
-                          <m:t>2</m:t>
-                        </m:r>
-                      </m:e>
-                    </m:mr>
-                    <m:mr>
-                      <m:e>
-                        <m:r>
-                          <m:t>3</m:t>
-                        </m:r>
-                      </m:e>
-                      <m:e>
-                        <m:r>
-                          <m:t>4</m:t>
-                        </m:r>
-                      </m:e>
-                    </m:mr>
-                  </m:m>
-                </m:e>
-              </m:d>
-            </m:e>
-          </m:d>
-          <m:r>
-            <m:t>​</m:t>
-          </m:r>
-          <m:r>
-            <m:rPr>
-              <m:sty m:val="p"/>
-            </m:rPr>
-            <m:t>=</m:t>
-          </m:r>
-          <m:r>
-            <m:t>1</m:t>
-          </m:r>
-          <m:r>
-            <m:rPr>
-              <m:sty m:val="p"/>
-            </m:rPr>
-            <m:t>+</m:t>
-          </m:r>
-          <m:r>
-            <m:t>4</m:t>
-          </m:r>
-          <m:r>
-            <m:rPr>
-              <m:sty m:val="p"/>
-            </m:rPr>
-            <m:t>=</m:t>
-          </m:r>
-          <m:r>
-            <m:t>5</m:t>
-          </m:r>
-        </m:oMath>
-      </m:oMathPara>
-    </w:p>
-    <w:bookmarkEnd w:id="50"/>
-    <w:bookmarkStart w:id="51" w:name="def-matrix-derivative"/>
-    <w:p>
-      <w:pPr>
-        <w:pStyle w:val="FirstParagraph"/>
-      </w:pPr>
-      <w:r>
-        <w:rPr>
-          <w:b/>
-          <w:bCs/>
-        </w:rPr>
-        <w:t xml:space="preserve">Definition 6 (Matrix derivative)</w:t>
+        <w:t xml:space="preserve">Definition 5 (Matrix derivative)</w:t>
       </w:r>
       <w:r>
         <w:t xml:space="preserve"> </w:t>
@@ -25441,8 +25102,8 @@
         </m:oMath>
       </m:oMathPara>
     </w:p>
-    <w:bookmarkEnd w:id="51"/>
-    <w:bookmarkStart w:id="52" w:name="exm-matrix-derivative"/>
+    <w:bookmarkEnd w:id="49"/>
+    <w:bookmarkStart w:id="51" w:name="exm-matrix-derivative"/>
     <w:p>
       <w:pPr>
         <w:pStyle w:val="FirstParagraph"/>
@@ -25452,7 +25113,7 @@
           <w:b/>
           <w:bCs/>
         </w:rPr>
-        <w:t xml:space="preserve">Example 14 (The matrix derivative of a trace)</w:t>
+        <w:t xml:space="preserve">Example 13 (The matrix derivative of a trace)</w:t>
       </w:r>
       <w:r>
         <w:t xml:space="preserve"> </w:t>
@@ -25596,14 +25257,17 @@
         <w:t xml:space="preserve"> </w:t>
       </w:r>
       <w:r>
-        <w:t xml:space="preserve">(</w:t>
-      </w:r>
-      <w:hyperlink w:anchor="def-trace">
+        <w:t xml:space="preserve">(see</w:t>
+      </w:r>
+      <w:r>
+        <w:t xml:space="preserve"> </w:t>
+      </w:r>
+      <w:hyperlink r:id="rId50">
         <w:r>
           <w:rPr>
             <w:rStyle w:val="Hyperlink"/>
           </w:rPr>
-          <w:t xml:space="preserve">Definition 5</w:t>
+          <w:t xml:space="preserve">trace</w:t>
         </w:r>
       </w:hyperlink>
       <w:r>
@@ -25775,8 +25439,8 @@
         </m:oMath>
       </m:oMathPara>
     </w:p>
-    <w:bookmarkEnd w:id="52"/>
-    <w:bookmarkStart w:id="53" w:name="thm-deriv-matrix-product-matrix"/>
+    <w:bookmarkEnd w:id="51"/>
+    <w:bookmarkStart w:id="52" w:name="thm-deriv-matrix-product-matrix"/>
     <w:p>
       <w:pPr>
         <w:pStyle w:val="FirstParagraph"/>
@@ -26294,7 +25958,7 @@
         <w:t xml:space="preserve">.</w:t>
       </w:r>
     </w:p>
-    <w:bookmarkEnd w:id="53"/>
+    <w:bookmarkEnd w:id="52"/>
     <w:p>
       <w:pPr>
         <w:pStyle w:val="BodyText"/>
@@ -27163,7 +26827,7 @@
         </m:oMath>
       </m:oMathPara>
     </w:p>
-    <w:bookmarkStart w:id="54" w:name="exm-deriv-matrix-product-matrix"/>
+    <w:bookmarkStart w:id="53" w:name="exm-deriv-matrix-product-matrix"/>
     <w:p>
       <w:pPr>
         <w:pStyle w:val="FirstParagraph"/>
@@ -27173,7 +26837,7 @@
           <w:b/>
           <w:bCs/>
         </w:rPr>
-        <w:t xml:space="preserve">Example 15 (Differentiating a weighted trace)</w:t>
+        <w:t xml:space="preserve">Example 14 (Differentiating a weighted trace)</w:t>
       </w:r>
       <w:r>
         <w:t xml:space="preserve"> </w:t>
@@ -27765,8 +27429,8 @@
         </m:oMath>
       </m:oMathPara>
     </w:p>
-    <w:bookmarkEnd w:id="54"/>
-    <w:bookmarkStart w:id="58" w:name="sec-additional-resources"/>
+    <w:bookmarkEnd w:id="53"/>
+    <w:bookmarkStart w:id="57" w:name="sec-additional-resources"/>
     <w:p>
       <w:pPr>
         <w:pStyle w:val="Heading2"/>
@@ -27785,7 +27449,7 @@
       <w:r>
         <w:t xml:space="preserve"> </w:t>
       </w:r>
-      <w:hyperlink r:id="rId55">
+      <w:hyperlink r:id="rId54">
         <w:r>
           <w:rPr>
             <w:rStyle w:val="Hyperlink"/>
@@ -27817,7 +27481,7 @@
           <w:numId w:val="1001"/>
         </w:numPr>
       </w:pPr>
-      <w:hyperlink r:id="rId56">
+      <w:hyperlink r:id="rId55">
         <w:r>
           <w:rPr>
             <w:rStyle w:val="Hyperlink"/>
@@ -27831,7 +27495,7 @@
       <w:r>
         <w:t xml:space="preserve"> </w:t>
       </w:r>
-      <w:hyperlink r:id="rId57">
+      <w:hyperlink r:id="rId56">
         <w:r>
           <w:rPr>
             <w:rStyle w:val="Hyperlink"/>
@@ -27864,8 +27528,8 @@
         </w:r>
       </w:hyperlink>
     </w:p>
-    <w:bookmarkEnd w:id="58"/>
-    <w:bookmarkStart w:id="62" w:name="references"/>
+    <w:bookmarkEnd w:id="57"/>
+    <w:bookmarkStart w:id="61" w:name="references"/>
     <w:p>
       <w:pPr>
         <w:pStyle w:val="Heading2"/>
@@ -27874,8 +27538,8 @@
         <w:t xml:space="preserve">References</w:t>
       </w:r>
     </w:p>
-    <w:bookmarkStart w:id="61" w:name="refs"/>
-    <w:bookmarkStart w:id="60" w:name="ref-fieller2018basics"/>
+    <w:bookmarkStart w:id="60" w:name="refs"/>
+    <w:bookmarkStart w:id="59" w:name="ref-fieller2018basics"/>
     <w:p>
       <w:pPr>
         <w:pStyle w:val="Bibliography"/>
@@ -27913,7 +27577,7 @@
       <w:r>
         <w:t xml:space="preserve"> </w:t>
       </w:r>
-      <w:hyperlink r:id="rId59">
+      <w:hyperlink r:id="rId58">
         <w:r>
           <w:rPr>
             <w:rStyle w:val="Hyperlink"/>
@@ -27925,9 +27589,9 @@
         <w:t xml:space="preserve">.</w:t>
       </w:r>
     </w:p>
+    <w:bookmarkEnd w:id="59"/>
     <w:bookmarkEnd w:id="60"/>
     <w:bookmarkEnd w:id="61"/>
-    <w:bookmarkEnd w:id="62"/>
     <w:sectPr>
       <w:footnotePr>
         <w:numRestart w:val="eachSect"/>

</xml_diff>

<commit_message>
Deploying to gh-pages from @ Morrison-Lab/mds@3ad7b61d78c4b50f3a9c03fd41ff7a45abd8473b 🚀
</commit_message>
<xml_diff>
--- a/vector-calculus.docx
+++ b/vector-calculus.docx
@@ -15,7 +15,7 @@
         <w:pStyle w:val="Date"/>
       </w:pPr>
       <w:r>
-        <w:t xml:space="preserve">Last modified: 2026-10-03 02:20:36 (PDT)</w:t>
+        <w:t xml:space="preserve">Last modified: 2026-10-03 02:36:14 (PDT)</w:t>
       </w:r>
     </w:p>
     <w:p>
@@ -15285,583 +15285,9 @@
       </m:oMathPara>
     </w:p>
     <w:bookmarkEnd w:id="36"/>
-    <w:bookmarkStart w:id="37" w:name="rem-deriv-matrix-vector-special-case"/>
     <w:p>
       <w:pPr>
         <w:pStyle w:val="FirstParagraph"/>
-      </w:pPr>
-      <w:r>
-        <w:rPr>
-          <w:i/>
-          <w:iCs/>
-        </w:rPr>
-        <w:t xml:space="preserve">Remark 2</w:t>
-      </w:r>
-      <w:r>
-        <w:t xml:space="preserve"> (The derivative of a linear map as a special case). </w:t>
-      </w:r>
-      <w:r>
-        <w:t xml:space="preserve">This result generalizes</w:t>
-      </w:r>
-      <w:r>
-        <w:t xml:space="preserve"> </w:t>
-      </w:r>
-      <w:hyperlink w:anchor="thm-deriv-linear-map">
-        <w:r>
-          <w:rPr>
-            <w:rStyle w:val="Hyperlink"/>
-          </w:rPr>
-          <w:t xml:space="preserve">Theorem 4</w:t>
-        </w:r>
-      </w:hyperlink>
-      <w:r>
-        <w:t xml:space="preserve">,</w:t>
-      </w:r>
-      <w:r>
-        <w:t xml:space="preserve"> </w:t>
-      </w:r>
-      <w:r>
-        <w:t xml:space="preserve">which is the special case</w:t>
-      </w:r>
-      <w:r>
-        <w:t xml:space="preserve"> </w:t>
-      </w:r>
-      <m:oMath>
-        <m:acc>
-          <m:accPr>
-            <m:chr m:val="̃"/>
-          </m:accPr>
-          <m:e>
-            <m:r>
-              <m:t>v</m:t>
-            </m:r>
-          </m:e>
-        </m:acc>
-        <m:r>
-          <m:rPr>
-            <m:sty m:val="p"/>
-          </m:rPr>
-          <m:t>=</m:t>
-        </m:r>
-        <m:acc>
-          <m:accPr>
-            <m:chr m:val="̃"/>
-          </m:accPr>
-          <m:e>
-            <m:r>
-              <m:t>β</m:t>
-            </m:r>
-          </m:e>
-        </m:acc>
-      </m:oMath>
-      <w:r>
-        <w:t xml:space="preserve"> </w:t>
-      </w:r>
-      <w:r>
-        <w:t xml:space="preserve">(so that</w:t>
-      </w:r>
-      <w:r>
-        <w:t xml:space="preserve"> </w:t>
-      </w:r>
-      <m:oMath>
-        <m:r>
-          <m:t>q</m:t>
-        </m:r>
-        <m:r>
-          <m:rPr>
-            <m:sty m:val="p"/>
-          </m:rPr>
-          <m:t>=</m:t>
-        </m:r>
-        <m:r>
-          <m:t>p</m:t>
-        </m:r>
-      </m:oMath>
-      <w:r>
-        <w:t xml:space="preserve">,</w:t>
-      </w:r>
-      <w:r>
-        <w:t xml:space="preserve"> </w:t>
-      </w:r>
-      <m:oMath>
-        <m:f>
-          <m:fPr>
-            <m:type m:val="bar"/>
-          </m:fPr>
-          <m:num>
-            <m:r>
-              <m:rPr>
-                <m:sty m:val="p"/>
-              </m:rPr>
-              <m:t>∂</m:t>
-            </m:r>
-          </m:num>
-          <m:den>
-            <m:r>
-              <m:rPr>
-                <m:sty m:val="p"/>
-              </m:rPr>
-              <m:t>∂</m:t>
-            </m:r>
-            <m:acc>
-              <m:accPr>
-                <m:chr m:val="̃"/>
-              </m:accPr>
-              <m:e>
-                <m:r>
-                  <m:t>β</m:t>
-                </m:r>
-              </m:e>
-            </m:acc>
-          </m:den>
-        </m:f>
-        <m:acc>
-          <m:accPr>
-            <m:chr m:val="̃"/>
-          </m:accPr>
-          <m:e>
-            <m:r>
-              <m:t>β</m:t>
-            </m:r>
-          </m:e>
-        </m:acc>
-        <m:r>
-          <m:rPr>
-            <m:sty m:val="p"/>
-          </m:rPr>
-          <m:t>=</m:t>
-        </m:r>
-        <m:sSub>
-          <m:e>
-            <m:r>
-              <m:rPr>
-                <m:sty m:val="bi"/>
-              </m:rPr>
-              <m:t>I</m:t>
-            </m:r>
-          </m:e>
-          <m:sub>
-            <m:r>
-              <m:t>p</m:t>
-            </m:r>
-          </m:sub>
-        </m:sSub>
-      </m:oMath>
-      <w:r>
-        <w:t xml:space="preserve">,</w:t>
-      </w:r>
-      <w:r>
-        <w:t xml:space="preserve"> </w:t>
-      </w:r>
-      <w:r>
-        <w:t xml:space="preserve">and</w:t>
-      </w:r>
-      <w:r>
-        <w:t xml:space="preserve"> </w:t>
-      </w:r>
-      <m:oMath>
-        <m:f>
-          <m:fPr>
-            <m:type m:val="bar"/>
-          </m:fPr>
-          <m:num>
-            <m:r>
-              <m:rPr>
-                <m:sty m:val="p"/>
-              </m:rPr>
-              <m:t>∂</m:t>
-            </m:r>
-          </m:num>
-          <m:den>
-            <m:r>
-              <m:rPr>
-                <m:sty m:val="p"/>
-              </m:rPr>
-              <m:t>∂</m:t>
-            </m:r>
-            <m:acc>
-              <m:accPr>
-                <m:chr m:val="̃"/>
-              </m:accPr>
-              <m:e>
-                <m:r>
-                  <m:t>β</m:t>
-                </m:r>
-              </m:e>
-            </m:acc>
-          </m:den>
-        </m:f>
-        <m:r>
-          <m:rPr>
-            <m:sty m:val="p"/>
-          </m:rPr>
-          <m:t>(</m:t>
-        </m:r>
-        <m:r>
-          <m:rPr>
-            <m:sty m:val="bi"/>
-          </m:rPr>
-          <m:t>A</m:t>
-        </m:r>
-        <m:acc>
-          <m:accPr>
-            <m:chr m:val="̃"/>
-          </m:accPr>
-          <m:e>
-            <m:r>
-              <m:t>β</m:t>
-            </m:r>
-          </m:e>
-        </m:acc>
-        <m:r>
-          <m:rPr>
-            <m:sty m:val="p"/>
-          </m:rPr>
-          <m:t>)</m:t>
-        </m:r>
-        <m:r>
-          <m:rPr>
-            <m:sty m:val="p"/>
-          </m:rPr>
-          <m:t>=</m:t>
-        </m:r>
-        <m:sSub>
-          <m:e>
-            <m:r>
-              <m:rPr>
-                <m:sty m:val="bi"/>
-              </m:rPr>
-              <m:t>I</m:t>
-            </m:r>
-          </m:e>
-          <m:sub>
-            <m:r>
-              <m:t>p</m:t>
-            </m:r>
-          </m:sub>
-        </m:sSub>
-        <m:sSup>
-          <m:e>
-            <m:r>
-              <m:rPr>
-                <m:sty m:val="bi"/>
-              </m:rPr>
-              <m:t>A</m:t>
-            </m:r>
-          </m:e>
-          <m:sup>
-            <m:r>
-              <m:rPr>
-                <m:sty m:val="p"/>
-              </m:rPr>
-              <m:t>⊤</m:t>
-            </m:r>
-          </m:sup>
-        </m:sSup>
-        <m:r>
-          <m:rPr>
-            <m:sty m:val="p"/>
-          </m:rPr>
-          <m:t>=</m:t>
-        </m:r>
-        <m:sSup>
-          <m:e>
-            <m:r>
-              <m:rPr>
-                <m:sty m:val="bi"/>
-              </m:rPr>
-              <m:t>A</m:t>
-            </m:r>
-          </m:e>
-          <m:sup>
-            <m:r>
-              <m:rPr>
-                <m:sty m:val="p"/>
-              </m:rPr>
-              <m:t>⊤</m:t>
-            </m:r>
-          </m:sup>
-        </m:sSup>
-      </m:oMath>
-      <w:r>
-        <w:t xml:space="preserve">).</w:t>
-      </w:r>
-      <w:r>
-        <w:t xml:space="preserve"> </w:t>
-      </w:r>
-      <w:r>
-        <w:t xml:space="preserve">For example,</w:t>
-      </w:r>
-      <w:r>
-        <w:t xml:space="preserve"> </w:t>
-      </w:r>
-      <w:hyperlink w:anchor="exm-deriv-linear-map">
-        <w:r>
-          <w:rPr>
-            <w:rStyle w:val="Hyperlink"/>
-          </w:rPr>
-          <w:t xml:space="preserve">Example 6</w:t>
-        </w:r>
-      </w:hyperlink>
-      <w:r>
-        <w:t xml:space="preserve"> </w:t>
-      </w:r>
-      <w:r>
-        <w:t xml:space="preserve">is the case</w:t>
-      </w:r>
-      <w:r>
-        <w:t xml:space="preserve"> </w:t>
-      </w:r>
-      <m:oMath>
-        <m:r>
-          <m:rPr>
-            <m:sty m:val="bi"/>
-          </m:rPr>
-          <m:t>A</m:t>
-        </m:r>
-        <m:r>
-          <m:rPr>
-            <m:sty m:val="p"/>
-          </m:rPr>
-          <m:t>=</m:t>
-        </m:r>
-        <m:d>
-          <m:dPr>
-            <m:begChr m:val="("/>
-            <m:sepChr m:val=""/>
-            <m:endChr m:val=")"/>
-            <m:grow/>
-          </m:dPr>
-          <m:e>
-            <m:m>
-              <m:mPr>
-                <m:baseJc m:val="center"/>
-                <m:plcHide m:val="on"/>
-                <m:mcs>
-                  <m:mc>
-                    <m:mcPr>
-                      <m:mcJc m:val="center"/>
-                      <m:count m:val="1"/>
-                    </m:mcPr>
-                  </m:mc>
-                  <m:mc>
-                    <m:mcPr>
-                      <m:mcJc m:val="center"/>
-                      <m:count m:val="1"/>
-                    </m:mcPr>
-                  </m:mc>
-                </m:mcs>
-              </m:mPr>
-              <m:mr>
-                <m:e>
-                  <m:r>
-                    <m:t>2</m:t>
-                  </m:r>
-                </m:e>
-                <m:e>
-                  <m:r>
-                    <m:t>3</m:t>
-                  </m:r>
-                </m:e>
-              </m:mr>
-            </m:m>
-          </m:e>
-        </m:d>
-      </m:oMath>
-      <w:r>
-        <w:t xml:space="preserve"> </w:t>
-      </w:r>
-      <w:r>
-        <w:t xml:space="preserve">and</w:t>
-      </w:r>
-      <w:r>
-        <w:t xml:space="preserve"> </w:t>
-      </w:r>
-      <m:oMath>
-        <m:acc>
-          <m:accPr>
-            <m:chr m:val="̃"/>
-          </m:accPr>
-          <m:e>
-            <m:r>
-              <m:t>v</m:t>
-            </m:r>
-          </m:e>
-        </m:acc>
-        <m:r>
-          <m:rPr>
-            <m:sty m:val="p"/>
-          </m:rPr>
-          <m:t>=</m:t>
-        </m:r>
-        <m:acc>
-          <m:accPr>
-            <m:chr m:val="̃"/>
-          </m:accPr>
-          <m:e>
-            <m:r>
-              <m:t>β</m:t>
-            </m:r>
-          </m:e>
-        </m:acc>
-        <m:r>
-          <m:rPr>
-            <m:sty m:val="p"/>
-          </m:rPr>
-          <m:t>=</m:t>
-        </m:r>
-        <m:sSup>
-          <m:e>
-            <m:r>
-              <m:rPr>
-                <m:sty m:val="p"/>
-              </m:rPr>
-              <m:t>(</m:t>
-            </m:r>
-            <m:sSub>
-              <m:e>
-                <m:r>
-                  <m:t>β</m:t>
-                </m:r>
-              </m:e>
-              <m:sub>
-                <m:r>
-                  <m:t>1</m:t>
-                </m:r>
-              </m:sub>
-            </m:sSub>
-            <m:r>
-              <m:rPr>
-                <m:sty m:val="p"/>
-              </m:rPr>
-              <m:t>,</m:t>
-            </m:r>
-            <m:sSub>
-              <m:e>
-                <m:r>
-                  <m:t>β</m:t>
-                </m:r>
-              </m:e>
-              <m:sub>
-                <m:r>
-                  <m:t>2</m:t>
-                </m:r>
-              </m:sub>
-            </m:sSub>
-            <m:r>
-              <m:rPr>
-                <m:sty m:val="p"/>
-              </m:rPr>
-              <m:t>)</m:t>
-            </m:r>
-          </m:e>
-          <m:sup>
-            <m:r>
-              <m:rPr>
-                <m:sty m:val="p"/>
-              </m:rPr>
-              <m:t>⊤</m:t>
-            </m:r>
-          </m:sup>
-        </m:sSup>
-      </m:oMath>
-      <w:r>
-        <w:t xml:space="preserve">,</w:t>
-      </w:r>
-      <w:r>
-        <w:t xml:space="preserve"> </w:t>
-      </w:r>
-      <w:r>
-        <w:t xml:space="preserve">where this result gives</w:t>
-      </w:r>
-      <w:r>
-        <w:t xml:space="preserve"> </w:t>
-      </w:r>
-      <m:oMath>
-        <m:sSub>
-          <m:e>
-            <m:r>
-              <m:rPr>
-                <m:sty m:val="bi"/>
-              </m:rPr>
-              <m:t>I</m:t>
-            </m:r>
-          </m:e>
-          <m:sub>
-            <m:r>
-              <m:t>2</m:t>
-            </m:r>
-          </m:sub>
-        </m:sSub>
-        <m:sSup>
-          <m:e>
-            <m:r>
-              <m:rPr>
-                <m:sty m:val="bi"/>
-              </m:rPr>
-              <m:t>A</m:t>
-            </m:r>
-          </m:e>
-          <m:sup>
-            <m:r>
-              <m:rPr>
-                <m:sty m:val="p"/>
-              </m:rPr>
-              <m:t>⊤</m:t>
-            </m:r>
-          </m:sup>
-        </m:sSup>
-        <m:r>
-          <m:rPr>
-            <m:sty m:val="p"/>
-          </m:rPr>
-          <m:t>=</m:t>
-        </m:r>
-        <m:sSup>
-          <m:e>
-            <m:r>
-              <m:rPr>
-                <m:sty m:val="p"/>
-              </m:rPr>
-              <m:t>(</m:t>
-            </m:r>
-            <m:r>
-              <m:t>2</m:t>
-            </m:r>
-            <m:r>
-              <m:rPr>
-                <m:sty m:val="p"/>
-              </m:rPr>
-              <m:t>,</m:t>
-            </m:r>
-            <m:r>
-              <m:t>3</m:t>
-            </m:r>
-            <m:r>
-              <m:rPr>
-                <m:sty m:val="p"/>
-              </m:rPr>
-              <m:t>)</m:t>
-            </m:r>
-          </m:e>
-          <m:sup>
-            <m:r>
-              <m:rPr>
-                <m:sty m:val="p"/>
-              </m:rPr>
-              <m:t>⊤</m:t>
-            </m:r>
-          </m:sup>
-        </m:sSup>
-      </m:oMath>
-      <w:r>
-        <w:t xml:space="preserve">.</w:t>
-      </w:r>
-    </w:p>
-    <w:bookmarkEnd w:id="37"/>
-    <w:p>
-      <w:pPr>
-        <w:pStyle w:val="BodyText"/>
       </w:pPr>
       <w:r>
         <w:rPr>
@@ -16626,7 +16052,7 @@
         </m:oMath>
       </m:oMathPara>
     </w:p>
-    <w:bookmarkStart w:id="38" w:name="exm-deriv-matrix-vector"/>
+    <w:bookmarkStart w:id="37" w:name="exm-deriv-matrix-vector"/>
     <w:p>
       <w:pPr>
         <w:pStyle w:val="FirstParagraph"/>
@@ -17248,11 +16674,585 @@
         </m:oMath>
       </m:oMathPara>
     </w:p>
+    <w:bookmarkEnd w:id="37"/>
+    <w:bookmarkStart w:id="38" w:name="rem-deriv-matrix-vector-special-case"/>
+    <w:p>
+      <w:pPr>
+        <w:pStyle w:val="FirstParagraph"/>
+      </w:pPr>
+      <w:r>
+        <w:rPr>
+          <w:i/>
+          <w:iCs/>
+        </w:rPr>
+        <w:t xml:space="preserve">Remark 2</w:t>
+      </w:r>
+      <w:r>
+        <w:t xml:space="preserve"> (The derivative of a linear map as a special case). </w:t>
+      </w:r>
+      <w:r>
+        <w:t xml:space="preserve">This result generalizes</w:t>
+      </w:r>
+      <w:r>
+        <w:t xml:space="preserve"> </w:t>
+      </w:r>
+      <w:hyperlink w:anchor="thm-deriv-linear-map">
+        <w:r>
+          <w:rPr>
+            <w:rStyle w:val="Hyperlink"/>
+          </w:rPr>
+          <w:t xml:space="preserve">Theorem 4</w:t>
+        </w:r>
+      </w:hyperlink>
+      <w:r>
+        <w:t xml:space="preserve">,</w:t>
+      </w:r>
+      <w:r>
+        <w:t xml:space="preserve"> </w:t>
+      </w:r>
+      <w:r>
+        <w:t xml:space="preserve">which is the special case</w:t>
+      </w:r>
+      <w:r>
+        <w:t xml:space="preserve"> </w:t>
+      </w:r>
+      <m:oMath>
+        <m:acc>
+          <m:accPr>
+            <m:chr m:val="̃"/>
+          </m:accPr>
+          <m:e>
+            <m:r>
+              <m:t>v</m:t>
+            </m:r>
+          </m:e>
+        </m:acc>
+        <m:r>
+          <m:rPr>
+            <m:sty m:val="p"/>
+          </m:rPr>
+          <m:t>=</m:t>
+        </m:r>
+        <m:acc>
+          <m:accPr>
+            <m:chr m:val="̃"/>
+          </m:accPr>
+          <m:e>
+            <m:r>
+              <m:t>β</m:t>
+            </m:r>
+          </m:e>
+        </m:acc>
+      </m:oMath>
+      <w:r>
+        <w:t xml:space="preserve"> </w:t>
+      </w:r>
+      <w:r>
+        <w:t xml:space="preserve">(so that</w:t>
+      </w:r>
+      <w:r>
+        <w:t xml:space="preserve"> </w:t>
+      </w:r>
+      <m:oMath>
+        <m:r>
+          <m:t>q</m:t>
+        </m:r>
+        <m:r>
+          <m:rPr>
+            <m:sty m:val="p"/>
+          </m:rPr>
+          <m:t>=</m:t>
+        </m:r>
+        <m:r>
+          <m:t>p</m:t>
+        </m:r>
+      </m:oMath>
+      <w:r>
+        <w:t xml:space="preserve">,</w:t>
+      </w:r>
+      <w:r>
+        <w:t xml:space="preserve"> </w:t>
+      </w:r>
+      <m:oMath>
+        <m:f>
+          <m:fPr>
+            <m:type m:val="bar"/>
+          </m:fPr>
+          <m:num>
+            <m:r>
+              <m:rPr>
+                <m:sty m:val="p"/>
+              </m:rPr>
+              <m:t>∂</m:t>
+            </m:r>
+          </m:num>
+          <m:den>
+            <m:r>
+              <m:rPr>
+                <m:sty m:val="p"/>
+              </m:rPr>
+              <m:t>∂</m:t>
+            </m:r>
+            <m:acc>
+              <m:accPr>
+                <m:chr m:val="̃"/>
+              </m:accPr>
+              <m:e>
+                <m:r>
+                  <m:t>β</m:t>
+                </m:r>
+              </m:e>
+            </m:acc>
+          </m:den>
+        </m:f>
+        <m:acc>
+          <m:accPr>
+            <m:chr m:val="̃"/>
+          </m:accPr>
+          <m:e>
+            <m:r>
+              <m:t>β</m:t>
+            </m:r>
+          </m:e>
+        </m:acc>
+        <m:r>
+          <m:rPr>
+            <m:sty m:val="p"/>
+          </m:rPr>
+          <m:t>=</m:t>
+        </m:r>
+        <m:sSub>
+          <m:e>
+            <m:r>
+              <m:rPr>
+                <m:sty m:val="bi"/>
+              </m:rPr>
+              <m:t>I</m:t>
+            </m:r>
+          </m:e>
+          <m:sub>
+            <m:r>
+              <m:t>p</m:t>
+            </m:r>
+          </m:sub>
+        </m:sSub>
+      </m:oMath>
+      <w:r>
+        <w:t xml:space="preserve">,</w:t>
+      </w:r>
+      <w:r>
+        <w:t xml:space="preserve"> </w:t>
+      </w:r>
+      <w:r>
+        <w:t xml:space="preserve">and</w:t>
+      </w:r>
+      <w:r>
+        <w:t xml:space="preserve"> </w:t>
+      </w:r>
+      <m:oMath>
+        <m:f>
+          <m:fPr>
+            <m:type m:val="bar"/>
+          </m:fPr>
+          <m:num>
+            <m:r>
+              <m:rPr>
+                <m:sty m:val="p"/>
+              </m:rPr>
+              <m:t>∂</m:t>
+            </m:r>
+          </m:num>
+          <m:den>
+            <m:r>
+              <m:rPr>
+                <m:sty m:val="p"/>
+              </m:rPr>
+              <m:t>∂</m:t>
+            </m:r>
+            <m:acc>
+              <m:accPr>
+                <m:chr m:val="̃"/>
+              </m:accPr>
+              <m:e>
+                <m:r>
+                  <m:t>β</m:t>
+                </m:r>
+              </m:e>
+            </m:acc>
+          </m:den>
+        </m:f>
+        <m:r>
+          <m:rPr>
+            <m:sty m:val="p"/>
+          </m:rPr>
+          <m:t>(</m:t>
+        </m:r>
+        <m:r>
+          <m:rPr>
+            <m:sty m:val="bi"/>
+          </m:rPr>
+          <m:t>A</m:t>
+        </m:r>
+        <m:acc>
+          <m:accPr>
+            <m:chr m:val="̃"/>
+          </m:accPr>
+          <m:e>
+            <m:r>
+              <m:t>β</m:t>
+            </m:r>
+          </m:e>
+        </m:acc>
+        <m:r>
+          <m:rPr>
+            <m:sty m:val="p"/>
+          </m:rPr>
+          <m:t>)</m:t>
+        </m:r>
+        <m:r>
+          <m:rPr>
+            <m:sty m:val="p"/>
+          </m:rPr>
+          <m:t>=</m:t>
+        </m:r>
+        <m:sSub>
+          <m:e>
+            <m:r>
+              <m:rPr>
+                <m:sty m:val="bi"/>
+              </m:rPr>
+              <m:t>I</m:t>
+            </m:r>
+          </m:e>
+          <m:sub>
+            <m:r>
+              <m:t>p</m:t>
+            </m:r>
+          </m:sub>
+        </m:sSub>
+        <m:sSup>
+          <m:e>
+            <m:r>
+              <m:rPr>
+                <m:sty m:val="bi"/>
+              </m:rPr>
+              <m:t>A</m:t>
+            </m:r>
+          </m:e>
+          <m:sup>
+            <m:r>
+              <m:rPr>
+                <m:sty m:val="p"/>
+              </m:rPr>
+              <m:t>⊤</m:t>
+            </m:r>
+          </m:sup>
+        </m:sSup>
+        <m:r>
+          <m:rPr>
+            <m:sty m:val="p"/>
+          </m:rPr>
+          <m:t>=</m:t>
+        </m:r>
+        <m:sSup>
+          <m:e>
+            <m:r>
+              <m:rPr>
+                <m:sty m:val="bi"/>
+              </m:rPr>
+              <m:t>A</m:t>
+            </m:r>
+          </m:e>
+          <m:sup>
+            <m:r>
+              <m:rPr>
+                <m:sty m:val="p"/>
+              </m:rPr>
+              <m:t>⊤</m:t>
+            </m:r>
+          </m:sup>
+        </m:sSup>
+      </m:oMath>
+      <w:r>
+        <w:t xml:space="preserve">).</w:t>
+      </w:r>
+      <w:r>
+        <w:t xml:space="preserve"> </w:t>
+      </w:r>
+      <w:r>
+        <w:t xml:space="preserve">For example,</w:t>
+      </w:r>
+      <w:r>
+        <w:t xml:space="preserve"> </w:t>
+      </w:r>
+      <w:hyperlink w:anchor="exm-deriv-linear-map">
+        <w:r>
+          <w:rPr>
+            <w:rStyle w:val="Hyperlink"/>
+          </w:rPr>
+          <w:t xml:space="preserve">Example 6</w:t>
+        </w:r>
+      </w:hyperlink>
+      <w:r>
+        <w:t xml:space="preserve"> </w:t>
+      </w:r>
+      <w:r>
+        <w:t xml:space="preserve">is the case</w:t>
+      </w:r>
+      <w:r>
+        <w:t xml:space="preserve"> </w:t>
+      </w:r>
+      <m:oMath>
+        <m:r>
+          <m:rPr>
+            <m:sty m:val="bi"/>
+          </m:rPr>
+          <m:t>A</m:t>
+        </m:r>
+        <m:r>
+          <m:rPr>
+            <m:sty m:val="p"/>
+          </m:rPr>
+          <m:t>=</m:t>
+        </m:r>
+        <m:d>
+          <m:dPr>
+            <m:begChr m:val="("/>
+            <m:sepChr m:val=""/>
+            <m:endChr m:val=")"/>
+            <m:grow/>
+          </m:dPr>
+          <m:e>
+            <m:m>
+              <m:mPr>
+                <m:baseJc m:val="center"/>
+                <m:plcHide m:val="on"/>
+                <m:mcs>
+                  <m:mc>
+                    <m:mcPr>
+                      <m:mcJc m:val="center"/>
+                      <m:count m:val="1"/>
+                    </m:mcPr>
+                  </m:mc>
+                  <m:mc>
+                    <m:mcPr>
+                      <m:mcJc m:val="center"/>
+                      <m:count m:val="1"/>
+                    </m:mcPr>
+                  </m:mc>
+                </m:mcs>
+              </m:mPr>
+              <m:mr>
+                <m:e>
+                  <m:r>
+                    <m:t>2</m:t>
+                  </m:r>
+                </m:e>
+                <m:e>
+                  <m:r>
+                    <m:t>3</m:t>
+                  </m:r>
+                </m:e>
+              </m:mr>
+            </m:m>
+          </m:e>
+        </m:d>
+      </m:oMath>
+      <w:r>
+        <w:t xml:space="preserve"> </w:t>
+      </w:r>
+      <w:r>
+        <w:t xml:space="preserve">and</w:t>
+      </w:r>
+      <w:r>
+        <w:t xml:space="preserve"> </w:t>
+      </w:r>
+      <m:oMath>
+        <m:acc>
+          <m:accPr>
+            <m:chr m:val="̃"/>
+          </m:accPr>
+          <m:e>
+            <m:r>
+              <m:t>v</m:t>
+            </m:r>
+          </m:e>
+        </m:acc>
+        <m:r>
+          <m:rPr>
+            <m:sty m:val="p"/>
+          </m:rPr>
+          <m:t>=</m:t>
+        </m:r>
+        <m:acc>
+          <m:accPr>
+            <m:chr m:val="̃"/>
+          </m:accPr>
+          <m:e>
+            <m:r>
+              <m:t>β</m:t>
+            </m:r>
+          </m:e>
+        </m:acc>
+        <m:r>
+          <m:rPr>
+            <m:sty m:val="p"/>
+          </m:rPr>
+          <m:t>=</m:t>
+        </m:r>
+        <m:sSup>
+          <m:e>
+            <m:r>
+              <m:rPr>
+                <m:sty m:val="p"/>
+              </m:rPr>
+              <m:t>(</m:t>
+            </m:r>
+            <m:sSub>
+              <m:e>
+                <m:r>
+                  <m:t>β</m:t>
+                </m:r>
+              </m:e>
+              <m:sub>
+                <m:r>
+                  <m:t>1</m:t>
+                </m:r>
+              </m:sub>
+            </m:sSub>
+            <m:r>
+              <m:rPr>
+                <m:sty m:val="p"/>
+              </m:rPr>
+              <m:t>,</m:t>
+            </m:r>
+            <m:sSub>
+              <m:e>
+                <m:r>
+                  <m:t>β</m:t>
+                </m:r>
+              </m:e>
+              <m:sub>
+                <m:r>
+                  <m:t>2</m:t>
+                </m:r>
+              </m:sub>
+            </m:sSub>
+            <m:r>
+              <m:rPr>
+                <m:sty m:val="p"/>
+              </m:rPr>
+              <m:t>)</m:t>
+            </m:r>
+          </m:e>
+          <m:sup>
+            <m:r>
+              <m:rPr>
+                <m:sty m:val="p"/>
+              </m:rPr>
+              <m:t>⊤</m:t>
+            </m:r>
+          </m:sup>
+        </m:sSup>
+      </m:oMath>
+      <w:r>
+        <w:t xml:space="preserve">,</w:t>
+      </w:r>
+      <w:r>
+        <w:t xml:space="preserve"> </w:t>
+      </w:r>
+      <w:r>
+        <w:t xml:space="preserve">where this result gives</w:t>
+      </w:r>
+      <w:r>
+        <w:t xml:space="preserve"> </w:t>
+      </w:r>
+      <m:oMath>
+        <m:sSub>
+          <m:e>
+            <m:r>
+              <m:rPr>
+                <m:sty m:val="bi"/>
+              </m:rPr>
+              <m:t>I</m:t>
+            </m:r>
+          </m:e>
+          <m:sub>
+            <m:r>
+              <m:t>2</m:t>
+            </m:r>
+          </m:sub>
+        </m:sSub>
+        <m:sSup>
+          <m:e>
+            <m:r>
+              <m:rPr>
+                <m:sty m:val="bi"/>
+              </m:rPr>
+              <m:t>A</m:t>
+            </m:r>
+          </m:e>
+          <m:sup>
+            <m:r>
+              <m:rPr>
+                <m:sty m:val="p"/>
+              </m:rPr>
+              <m:t>⊤</m:t>
+            </m:r>
+          </m:sup>
+        </m:sSup>
+        <m:r>
+          <m:rPr>
+            <m:sty m:val="p"/>
+          </m:rPr>
+          <m:t>=</m:t>
+        </m:r>
+        <m:sSup>
+          <m:e>
+            <m:r>
+              <m:rPr>
+                <m:sty m:val="p"/>
+              </m:rPr>
+              <m:t>(</m:t>
+            </m:r>
+            <m:r>
+              <m:t>2</m:t>
+            </m:r>
+            <m:r>
+              <m:rPr>
+                <m:sty m:val="p"/>
+              </m:rPr>
+              <m:t>,</m:t>
+            </m:r>
+            <m:r>
+              <m:t>3</m:t>
+            </m:r>
+            <m:r>
+              <m:rPr>
+                <m:sty m:val="p"/>
+              </m:rPr>
+              <m:t>)</m:t>
+            </m:r>
+          </m:e>
+          <m:sup>
+            <m:r>
+              <m:rPr>
+                <m:sty m:val="p"/>
+              </m:rPr>
+              <m:t>⊤</m:t>
+            </m:r>
+          </m:sup>
+        </m:sSup>
+      </m:oMath>
+      <w:r>
+        <w:t xml:space="preserve">.</w:t>
+      </w:r>
+    </w:p>
     <w:bookmarkEnd w:id="38"/>
     <w:bookmarkStart w:id="39" w:name="thm-deriv-matrix-product-vector"/>
     <w:p>
       <w:pPr>
-        <w:pStyle w:val="FirstParagraph"/>
+        <w:pStyle w:val="BodyText"/>
       </w:pPr>
       <w:r>
         <w:rPr>
@@ -19343,461 +19343,9 @@
       </m:oMathPara>
     </w:p>
     <w:bookmarkEnd w:id="42"/>
-    <w:bookmarkStart w:id="43" w:name="rem-deriv-lincom-tp-transpose"/>
     <w:p>
       <w:pPr>
         <w:pStyle w:val="FirstParagraph"/>
-      </w:pPr>
-      <w:r>
-        <w:rPr>
-          <w:i/>
-          <w:iCs/>
-        </w:rPr>
-        <w:t xml:space="preserve">Remark 3</w:t>
-      </w:r>
-      <w:r>
-        <w:t xml:space="preserve"> (The coefficient gets transposed). </w:t>
-      </w:r>
-      <w:r>
-        <w:t xml:space="preserve">This vector derivative formula looks a lot like non-vector calculus,</w:t>
-      </w:r>
-      <w:r>
-        <w:t xml:space="preserve"> </w:t>
-      </w:r>
-      <w:r>
-        <w:t xml:space="preserve">except that you have to transpose the coefficient:</w:t>
-      </w:r>
-      <w:r>
-        <w:t xml:space="preserve"> </w:t>
-      </w:r>
-      <w:r>
-        <w:t xml:space="preserve">in scalar calculus</w:t>
-      </w:r>
-      <w:r>
-        <w:t xml:space="preserve"> </w:t>
-      </w:r>
-      <m:oMath>
-        <m:f>
-          <m:fPr>
-            <m:type m:val="bar"/>
-          </m:fPr>
-          <m:num>
-            <m:r>
-              <m:rPr>
-                <m:sty m:val="p"/>
-              </m:rPr>
-              <m:t>∂</m:t>
-            </m:r>
-          </m:num>
-          <m:den>
-            <m:r>
-              <m:rPr>
-                <m:sty m:val="p"/>
-              </m:rPr>
-              <m:t>∂</m:t>
-            </m:r>
-            <m:r>
-              <m:t>x</m:t>
-            </m:r>
-          </m:den>
-        </m:f>
-        <m:r>
-          <m:rPr>
-            <m:sty m:val="p"/>
-          </m:rPr>
-          <m:t>(</m:t>
-        </m:r>
-        <m:r>
-          <m:t>c</m:t>
-        </m:r>
-        <m:r>
-          <m:t>x</m:t>
-        </m:r>
-        <m:r>
-          <m:rPr>
-            <m:sty m:val="p"/>
-          </m:rPr>
-          <m:t>)</m:t>
-        </m:r>
-        <m:r>
-          <m:rPr>
-            <m:sty m:val="p"/>
-          </m:rPr>
-          <m:t>=</m:t>
-        </m:r>
-        <m:r>
-          <m:t>c</m:t>
-        </m:r>
-      </m:oMath>
-      <w:r>
-        <w:t xml:space="preserve">,</w:t>
-      </w:r>
-      <w:r>
-        <w:t xml:space="preserve"> </w:t>
-      </w:r>
-      <w:r>
-        <w:t xml:space="preserve">but here the coefficient</w:t>
-      </w:r>
-      <w:r>
-        <w:t xml:space="preserve"> </w:t>
-      </w:r>
-      <m:oMath>
-        <m:sSup>
-          <m:e>
-            <m:acc>
-              <m:accPr>
-                <m:chr m:val="̃"/>
-              </m:accPr>
-              <m:e>
-                <m:r>
-                  <m:t>x</m:t>
-                </m:r>
-              </m:e>
-            </m:acc>
-          </m:e>
-          <m:sup>
-            <m:r>
-              <m:rPr>
-                <m:sty m:val="p"/>
-              </m:rPr>
-              <m:t>⊤</m:t>
-            </m:r>
-          </m:sup>
-        </m:sSup>
-      </m:oMath>
-      <w:r>
-        <w:t xml:space="preserve"> </w:t>
-      </w:r>
-      <w:r>
-        <w:t xml:space="preserve">(a row vector)</w:t>
-      </w:r>
-      <w:r>
-        <w:t xml:space="preserve"> </w:t>
-      </w:r>
-      <w:r>
-        <w:t xml:space="preserve">becomes</w:t>
-      </w:r>
-      <w:r>
-        <w:t xml:space="preserve"> </w:t>
-      </w:r>
-      <m:oMath>
-        <m:acc>
-          <m:accPr>
-            <m:chr m:val="̃"/>
-          </m:accPr>
-          <m:e>
-            <m:r>
-              <m:t>x</m:t>
-            </m:r>
-          </m:e>
-        </m:acc>
-      </m:oMath>
-      <w:r>
-        <w:t xml:space="preserve"> </w:t>
-      </w:r>
-      <w:r>
-        <w:t xml:space="preserve">(a column vector) in the result.</w:t>
-      </w:r>
-      <w:r>
-        <w:t xml:space="preserve"> </w:t>
-      </w:r>
-      <w:r>
-        <w:t xml:space="preserve">For example, with</w:t>
-      </w:r>
-      <w:r>
-        <w:t xml:space="preserve"> </w:t>
-      </w:r>
-      <m:oMath>
-        <m:acc>
-          <m:accPr>
-            <m:chr m:val="̃"/>
-          </m:accPr>
-          <m:e>
-            <m:r>
-              <m:t>x</m:t>
-            </m:r>
-          </m:e>
-        </m:acc>
-        <m:r>
-          <m:rPr>
-            <m:sty m:val="p"/>
-          </m:rPr>
-          <m:t>=</m:t>
-        </m:r>
-        <m:sSup>
-          <m:e>
-            <m:r>
-              <m:rPr>
-                <m:sty m:val="p"/>
-              </m:rPr>
-              <m:t>(</m:t>
-            </m:r>
-            <m:r>
-              <m:t>2</m:t>
-            </m:r>
-            <m:r>
-              <m:rPr>
-                <m:sty m:val="p"/>
-              </m:rPr>
-              <m:t>,</m:t>
-            </m:r>
-            <m:r>
-              <m:rPr>
-                <m:sty m:val="p"/>
-              </m:rPr>
-              <m:t>−</m:t>
-            </m:r>
-            <m:r>
-              <m:t>1</m:t>
-            </m:r>
-            <m:r>
-              <m:rPr>
-                <m:sty m:val="p"/>
-              </m:rPr>
-              <m:t>)</m:t>
-            </m:r>
-          </m:e>
-          <m:sup>
-            <m:r>
-              <m:rPr>
-                <m:sty m:val="p"/>
-              </m:rPr>
-              <m:t>⊤</m:t>
-            </m:r>
-          </m:sup>
-        </m:sSup>
-      </m:oMath>
-      <w:r>
-        <w:t xml:space="preserve">,</w:t>
-      </w:r>
-      <w:r>
-        <w:t xml:space="preserve"> </w:t>
-      </w:r>
-      <m:oMath>
-        <m:sSup>
-          <m:e>
-            <m:acc>
-              <m:accPr>
-                <m:chr m:val="̃"/>
-              </m:accPr>
-              <m:e>
-                <m:r>
-                  <m:t>x</m:t>
-                </m:r>
-              </m:e>
-            </m:acc>
-          </m:e>
-          <m:sup>
-            <m:r>
-              <m:rPr>
-                <m:sty m:val="p"/>
-              </m:rPr>
-              <m:t>⊤</m:t>
-            </m:r>
-          </m:sup>
-        </m:sSup>
-        <m:acc>
-          <m:accPr>
-            <m:chr m:val="̃"/>
-          </m:accPr>
-          <m:e>
-            <m:r>
-              <m:t>β</m:t>
-            </m:r>
-          </m:e>
-        </m:acc>
-        <m:r>
-          <m:rPr>
-            <m:sty m:val="p"/>
-          </m:rPr>
-          <m:t>=</m:t>
-        </m:r>
-        <m:r>
-          <m:t>2</m:t>
-        </m:r>
-        <m:sSub>
-          <m:e>
-            <m:r>
-              <m:t>β</m:t>
-            </m:r>
-          </m:e>
-          <m:sub>
-            <m:r>
-              <m:t>1</m:t>
-            </m:r>
-          </m:sub>
-        </m:sSub>
-        <m:r>
-          <m:rPr>
-            <m:sty m:val="p"/>
-          </m:rPr>
-          <m:t>−</m:t>
-        </m:r>
-        <m:sSub>
-          <m:e>
-            <m:r>
-              <m:t>β</m:t>
-            </m:r>
-          </m:e>
-          <m:sub>
-            <m:r>
-              <m:t>2</m:t>
-            </m:r>
-          </m:sub>
-        </m:sSub>
-      </m:oMath>
-      <w:r>
-        <w:t xml:space="preserve">,</w:t>
-      </w:r>
-      <w:r>
-        <w:t xml:space="preserve"> </w:t>
-      </w:r>
-      <w:r>
-        <w:t xml:space="preserve">whose vector derivative is the column vector</w:t>
-      </w:r>
-      <w:r>
-        <w:t xml:space="preserve"> </w:t>
-      </w:r>
-      <m:oMath>
-        <m:sSup>
-          <m:e>
-            <m:r>
-              <m:rPr>
-                <m:sty m:val="p"/>
-              </m:rPr>
-              <m:t>(</m:t>
-            </m:r>
-            <m:r>
-              <m:t>2</m:t>
-            </m:r>
-            <m:r>
-              <m:rPr>
-                <m:sty m:val="p"/>
-              </m:rPr>
-              <m:t>,</m:t>
-            </m:r>
-            <m:r>
-              <m:rPr>
-                <m:sty m:val="p"/>
-              </m:rPr>
-              <m:t>−</m:t>
-            </m:r>
-            <m:r>
-              <m:t>1</m:t>
-            </m:r>
-            <m:r>
-              <m:rPr>
-                <m:sty m:val="p"/>
-              </m:rPr>
-              <m:t>)</m:t>
-            </m:r>
-          </m:e>
-          <m:sup>
-            <m:r>
-              <m:rPr>
-                <m:sty m:val="p"/>
-              </m:rPr>
-              <m:t>⊤</m:t>
-            </m:r>
-          </m:sup>
-        </m:sSup>
-        <m:r>
-          <m:rPr>
-            <m:sty m:val="p"/>
-          </m:rPr>
-          <m:t>=</m:t>
-        </m:r>
-        <m:acc>
-          <m:accPr>
-            <m:chr m:val="̃"/>
-          </m:accPr>
-          <m:e>
-            <m:r>
-              <m:t>x</m:t>
-            </m:r>
-          </m:e>
-        </m:acc>
-      </m:oMath>
-      <w:r>
-        <w:t xml:space="preserve">,</w:t>
-      </w:r>
-      <w:r>
-        <w:t xml:space="preserve"> </w:t>
-      </w:r>
-      <w:r>
-        <w:t xml:space="preserve">not the row vector</w:t>
-      </w:r>
-      <w:r>
-        <w:t xml:space="preserve"> </w:t>
-      </w:r>
-      <m:oMath>
-        <m:sSup>
-          <m:e>
-            <m:acc>
-              <m:accPr>
-                <m:chr m:val="̃"/>
-              </m:accPr>
-              <m:e>
-                <m:r>
-                  <m:t>x</m:t>
-                </m:r>
-              </m:e>
-            </m:acc>
-          </m:e>
-          <m:sup>
-            <m:r>
-              <m:rPr>
-                <m:sty m:val="p"/>
-              </m:rPr>
-              <m:t>⊤</m:t>
-            </m:r>
-          </m:sup>
-        </m:sSup>
-        <m:r>
-          <m:rPr>
-            <m:sty m:val="p"/>
-          </m:rPr>
-          <m:t>=</m:t>
-        </m:r>
-        <m:r>
-          <m:rPr>
-            <m:sty m:val="p"/>
-          </m:rPr>
-          <m:t>(</m:t>
-        </m:r>
-        <m:r>
-          <m:t>2</m:t>
-        </m:r>
-        <m:r>
-          <m:rPr>
-            <m:sty m:val="p"/>
-          </m:rPr>
-          <m:t>,</m:t>
-        </m:r>
-        <m:r>
-          <m:rPr>
-            <m:sty m:val="p"/>
-          </m:rPr>
-          <m:t>−</m:t>
-        </m:r>
-        <m:r>
-          <m:t>1</m:t>
-        </m:r>
-        <m:r>
-          <m:rPr>
-            <m:sty m:val="p"/>
-          </m:rPr>
-          <m:t>)</m:t>
-        </m:r>
-      </m:oMath>
-      <w:r>
-        <w:t xml:space="preserve">.</w:t>
-      </w:r>
-    </w:p>
-    <w:bookmarkEnd w:id="43"/>
-    <w:p>
-      <w:pPr>
-        <w:pStyle w:val="BodyText"/>
       </w:pPr>
       <w:r>
         <w:rPr>
@@ -20722,7 +20270,7 @@
         </m:oMath>
       </m:oMathPara>
     </w:p>
-    <w:bookmarkStart w:id="44" w:name="exm-deriv-lincom-tp"/>
+    <w:bookmarkStart w:id="43" w:name="exm-deriv-lincom-tp"/>
     <w:p>
       <w:pPr>
         <w:pStyle w:val="FirstParagraph"/>
@@ -21249,11 +20797,463 @@
         </m:oMath>
       </m:oMathPara>
     </w:p>
+    <w:bookmarkEnd w:id="43"/>
+    <w:bookmarkStart w:id="44" w:name="rem-deriv-lincom-tp-transpose"/>
+    <w:p>
+      <w:pPr>
+        <w:pStyle w:val="FirstParagraph"/>
+      </w:pPr>
+      <w:r>
+        <w:rPr>
+          <w:i/>
+          <w:iCs/>
+        </w:rPr>
+        <w:t xml:space="preserve">Remark 3</w:t>
+      </w:r>
+      <w:r>
+        <w:t xml:space="preserve"> (The coefficient gets transposed). </w:t>
+      </w:r>
+      <w:r>
+        <w:t xml:space="preserve">This vector derivative formula looks a lot like non-vector calculus,</w:t>
+      </w:r>
+      <w:r>
+        <w:t xml:space="preserve"> </w:t>
+      </w:r>
+      <w:r>
+        <w:t xml:space="preserve">except that you have to transpose the coefficient:</w:t>
+      </w:r>
+      <w:r>
+        <w:t xml:space="preserve"> </w:t>
+      </w:r>
+      <w:r>
+        <w:t xml:space="preserve">in scalar calculus</w:t>
+      </w:r>
+      <w:r>
+        <w:t xml:space="preserve"> </w:t>
+      </w:r>
+      <m:oMath>
+        <m:f>
+          <m:fPr>
+            <m:type m:val="bar"/>
+          </m:fPr>
+          <m:num>
+            <m:r>
+              <m:rPr>
+                <m:sty m:val="p"/>
+              </m:rPr>
+              <m:t>∂</m:t>
+            </m:r>
+          </m:num>
+          <m:den>
+            <m:r>
+              <m:rPr>
+                <m:sty m:val="p"/>
+              </m:rPr>
+              <m:t>∂</m:t>
+            </m:r>
+            <m:r>
+              <m:t>x</m:t>
+            </m:r>
+          </m:den>
+        </m:f>
+        <m:r>
+          <m:rPr>
+            <m:sty m:val="p"/>
+          </m:rPr>
+          <m:t>(</m:t>
+        </m:r>
+        <m:r>
+          <m:t>c</m:t>
+        </m:r>
+        <m:r>
+          <m:t>x</m:t>
+        </m:r>
+        <m:r>
+          <m:rPr>
+            <m:sty m:val="p"/>
+          </m:rPr>
+          <m:t>)</m:t>
+        </m:r>
+        <m:r>
+          <m:rPr>
+            <m:sty m:val="p"/>
+          </m:rPr>
+          <m:t>=</m:t>
+        </m:r>
+        <m:r>
+          <m:t>c</m:t>
+        </m:r>
+      </m:oMath>
+      <w:r>
+        <w:t xml:space="preserve">,</w:t>
+      </w:r>
+      <w:r>
+        <w:t xml:space="preserve"> </w:t>
+      </w:r>
+      <w:r>
+        <w:t xml:space="preserve">but here the coefficient</w:t>
+      </w:r>
+      <w:r>
+        <w:t xml:space="preserve"> </w:t>
+      </w:r>
+      <m:oMath>
+        <m:sSup>
+          <m:e>
+            <m:acc>
+              <m:accPr>
+                <m:chr m:val="̃"/>
+              </m:accPr>
+              <m:e>
+                <m:r>
+                  <m:t>x</m:t>
+                </m:r>
+              </m:e>
+            </m:acc>
+          </m:e>
+          <m:sup>
+            <m:r>
+              <m:rPr>
+                <m:sty m:val="p"/>
+              </m:rPr>
+              <m:t>⊤</m:t>
+            </m:r>
+          </m:sup>
+        </m:sSup>
+      </m:oMath>
+      <w:r>
+        <w:t xml:space="preserve"> </w:t>
+      </w:r>
+      <w:r>
+        <w:t xml:space="preserve">(a row vector)</w:t>
+      </w:r>
+      <w:r>
+        <w:t xml:space="preserve"> </w:t>
+      </w:r>
+      <w:r>
+        <w:t xml:space="preserve">becomes</w:t>
+      </w:r>
+      <w:r>
+        <w:t xml:space="preserve"> </w:t>
+      </w:r>
+      <m:oMath>
+        <m:acc>
+          <m:accPr>
+            <m:chr m:val="̃"/>
+          </m:accPr>
+          <m:e>
+            <m:r>
+              <m:t>x</m:t>
+            </m:r>
+          </m:e>
+        </m:acc>
+      </m:oMath>
+      <w:r>
+        <w:t xml:space="preserve"> </w:t>
+      </w:r>
+      <w:r>
+        <w:t xml:space="preserve">(a column vector) in the result.</w:t>
+      </w:r>
+      <w:r>
+        <w:t xml:space="preserve"> </w:t>
+      </w:r>
+      <w:r>
+        <w:t xml:space="preserve">For example, with</w:t>
+      </w:r>
+      <w:r>
+        <w:t xml:space="preserve"> </w:t>
+      </w:r>
+      <m:oMath>
+        <m:acc>
+          <m:accPr>
+            <m:chr m:val="̃"/>
+          </m:accPr>
+          <m:e>
+            <m:r>
+              <m:t>x</m:t>
+            </m:r>
+          </m:e>
+        </m:acc>
+        <m:r>
+          <m:rPr>
+            <m:sty m:val="p"/>
+          </m:rPr>
+          <m:t>=</m:t>
+        </m:r>
+        <m:sSup>
+          <m:e>
+            <m:r>
+              <m:rPr>
+                <m:sty m:val="p"/>
+              </m:rPr>
+              <m:t>(</m:t>
+            </m:r>
+            <m:r>
+              <m:t>2</m:t>
+            </m:r>
+            <m:r>
+              <m:rPr>
+                <m:sty m:val="p"/>
+              </m:rPr>
+              <m:t>,</m:t>
+            </m:r>
+            <m:r>
+              <m:rPr>
+                <m:sty m:val="p"/>
+              </m:rPr>
+              <m:t>−</m:t>
+            </m:r>
+            <m:r>
+              <m:t>1</m:t>
+            </m:r>
+            <m:r>
+              <m:rPr>
+                <m:sty m:val="p"/>
+              </m:rPr>
+              <m:t>)</m:t>
+            </m:r>
+          </m:e>
+          <m:sup>
+            <m:r>
+              <m:rPr>
+                <m:sty m:val="p"/>
+              </m:rPr>
+              <m:t>⊤</m:t>
+            </m:r>
+          </m:sup>
+        </m:sSup>
+      </m:oMath>
+      <w:r>
+        <w:t xml:space="preserve">,</w:t>
+      </w:r>
+      <w:r>
+        <w:t xml:space="preserve"> </w:t>
+      </w:r>
+      <m:oMath>
+        <m:sSup>
+          <m:e>
+            <m:acc>
+              <m:accPr>
+                <m:chr m:val="̃"/>
+              </m:accPr>
+              <m:e>
+                <m:r>
+                  <m:t>x</m:t>
+                </m:r>
+              </m:e>
+            </m:acc>
+          </m:e>
+          <m:sup>
+            <m:r>
+              <m:rPr>
+                <m:sty m:val="p"/>
+              </m:rPr>
+              <m:t>⊤</m:t>
+            </m:r>
+          </m:sup>
+        </m:sSup>
+        <m:acc>
+          <m:accPr>
+            <m:chr m:val="̃"/>
+          </m:accPr>
+          <m:e>
+            <m:r>
+              <m:t>β</m:t>
+            </m:r>
+          </m:e>
+        </m:acc>
+        <m:r>
+          <m:rPr>
+            <m:sty m:val="p"/>
+          </m:rPr>
+          <m:t>=</m:t>
+        </m:r>
+        <m:r>
+          <m:t>2</m:t>
+        </m:r>
+        <m:sSub>
+          <m:e>
+            <m:r>
+              <m:t>β</m:t>
+            </m:r>
+          </m:e>
+          <m:sub>
+            <m:r>
+              <m:t>1</m:t>
+            </m:r>
+          </m:sub>
+        </m:sSub>
+        <m:r>
+          <m:rPr>
+            <m:sty m:val="p"/>
+          </m:rPr>
+          <m:t>−</m:t>
+        </m:r>
+        <m:sSub>
+          <m:e>
+            <m:r>
+              <m:t>β</m:t>
+            </m:r>
+          </m:e>
+          <m:sub>
+            <m:r>
+              <m:t>2</m:t>
+            </m:r>
+          </m:sub>
+        </m:sSub>
+      </m:oMath>
+      <w:r>
+        <w:t xml:space="preserve">,</w:t>
+      </w:r>
+      <w:r>
+        <w:t xml:space="preserve"> </w:t>
+      </w:r>
+      <w:r>
+        <w:t xml:space="preserve">whose vector derivative is the column vector</w:t>
+      </w:r>
+      <w:r>
+        <w:t xml:space="preserve"> </w:t>
+      </w:r>
+      <m:oMath>
+        <m:sSup>
+          <m:e>
+            <m:r>
+              <m:rPr>
+                <m:sty m:val="p"/>
+              </m:rPr>
+              <m:t>(</m:t>
+            </m:r>
+            <m:r>
+              <m:t>2</m:t>
+            </m:r>
+            <m:r>
+              <m:rPr>
+                <m:sty m:val="p"/>
+              </m:rPr>
+              <m:t>,</m:t>
+            </m:r>
+            <m:r>
+              <m:rPr>
+                <m:sty m:val="p"/>
+              </m:rPr>
+              <m:t>−</m:t>
+            </m:r>
+            <m:r>
+              <m:t>1</m:t>
+            </m:r>
+            <m:r>
+              <m:rPr>
+                <m:sty m:val="p"/>
+              </m:rPr>
+              <m:t>)</m:t>
+            </m:r>
+          </m:e>
+          <m:sup>
+            <m:r>
+              <m:rPr>
+                <m:sty m:val="p"/>
+              </m:rPr>
+              <m:t>⊤</m:t>
+            </m:r>
+          </m:sup>
+        </m:sSup>
+        <m:r>
+          <m:rPr>
+            <m:sty m:val="p"/>
+          </m:rPr>
+          <m:t>=</m:t>
+        </m:r>
+        <m:acc>
+          <m:accPr>
+            <m:chr m:val="̃"/>
+          </m:accPr>
+          <m:e>
+            <m:r>
+              <m:t>x</m:t>
+            </m:r>
+          </m:e>
+        </m:acc>
+      </m:oMath>
+      <w:r>
+        <w:t xml:space="preserve">,</w:t>
+      </w:r>
+      <w:r>
+        <w:t xml:space="preserve"> </w:t>
+      </w:r>
+      <w:r>
+        <w:t xml:space="preserve">not the row vector</w:t>
+      </w:r>
+      <w:r>
+        <w:t xml:space="preserve"> </w:t>
+      </w:r>
+      <m:oMath>
+        <m:sSup>
+          <m:e>
+            <m:acc>
+              <m:accPr>
+                <m:chr m:val="̃"/>
+              </m:accPr>
+              <m:e>
+                <m:r>
+                  <m:t>x</m:t>
+                </m:r>
+              </m:e>
+            </m:acc>
+          </m:e>
+          <m:sup>
+            <m:r>
+              <m:rPr>
+                <m:sty m:val="p"/>
+              </m:rPr>
+              <m:t>⊤</m:t>
+            </m:r>
+          </m:sup>
+        </m:sSup>
+        <m:r>
+          <m:rPr>
+            <m:sty m:val="p"/>
+          </m:rPr>
+          <m:t>=</m:t>
+        </m:r>
+        <m:r>
+          <m:rPr>
+            <m:sty m:val="p"/>
+          </m:rPr>
+          <m:t>(</m:t>
+        </m:r>
+        <m:r>
+          <m:t>2</m:t>
+        </m:r>
+        <m:r>
+          <m:rPr>
+            <m:sty m:val="p"/>
+          </m:rPr>
+          <m:t>,</m:t>
+        </m:r>
+        <m:r>
+          <m:rPr>
+            <m:sty m:val="p"/>
+          </m:rPr>
+          <m:t>−</m:t>
+        </m:r>
+        <m:r>
+          <m:t>1</m:t>
+        </m:r>
+        <m:r>
+          <m:rPr>
+            <m:sty m:val="p"/>
+          </m:rPr>
+          <m:t>)</m:t>
+        </m:r>
+      </m:oMath>
+      <w:r>
+        <w:t xml:space="preserve">.</w:t>
+      </w:r>
+    </w:p>
     <w:bookmarkEnd w:id="44"/>
     <w:bookmarkStart w:id="46" w:name="thm-quadratic-form"/>
     <w:p>
       <w:pPr>
-        <w:pStyle w:val="FirstParagraph"/>
+        <w:pStyle w:val="BodyText"/>
       </w:pPr>
       <w:r>
         <w:rPr>

</xml_diff>

<commit_message>
Deploying to gh-pages from @ Morrison-Lab/mds@ed0f9575a8356e2c028ef0c17626091188cb5751 🚀
</commit_message>
<xml_diff>
--- a/vector-calculus.docx
+++ b/vector-calculus.docx
@@ -15,7 +15,7 @@
         <w:pStyle w:val="Date"/>
       </w:pPr>
       <w:r>
-        <w:t xml:space="preserve">Last modified: 2026-10-09 00:29:41 (UTC)</w:t>
+        <w:t xml:space="preserve">Last modified: 2026-10-08 18:28:41 (PDT)</w:t>
       </w:r>
     </w:p>
     <w:p>
@@ -6632,28 +6632,22 @@
           </m:rPr>
           <m:t>=</m:t>
         </m:r>
-        <m:sSup>
+        <m:acc>
+          <m:accPr>
+            <m:chr m:val="̃"/>
+          </m:accPr>
           <m:e>
-            <m:acc>
-              <m:accPr>
-                <m:chr m:val="̃"/>
-              </m:accPr>
-              <m:e>
-                <m:r>
-                  <m:t>x</m:t>
-                </m:r>
-              </m:e>
-            </m:acc>
+            <m:r>
+              <m:t>x</m:t>
+            </m:r>
           </m:e>
-          <m:sup>
-            <m:r>
-              <m:rPr>
-                <m:sty m:val="p"/>
-              </m:rPr>
-              <m:t>⊤</m:t>
-            </m:r>
-          </m:sup>
-        </m:sSup>
+        </m:acc>
+        <m:r>
+          <m:rPr>
+            <m:sty m:val="p"/>
+          </m:rPr>
+          <m:t>⋅</m:t>
+        </m:r>
         <m:acc>
           <m:accPr>
             <m:chr m:val="̃"/>
@@ -12596,28 +12590,22 @@
           </m:rPr>
           <m:t>=</m:t>
         </m:r>
-        <m:sSup>
+        <m:acc>
+          <m:accPr>
+            <m:chr m:val="̃"/>
+          </m:accPr>
           <m:e>
-            <m:acc>
-              <m:accPr>
-                <m:chr m:val="̃"/>
-              </m:accPr>
-              <m:e>
-                <m:r>
-                  <m:t>x</m:t>
-                </m:r>
-              </m:e>
-            </m:acc>
+            <m:r>
+              <m:t>x</m:t>
+            </m:r>
           </m:e>
-          <m:sup>
-            <m:r>
-              <m:rPr>
-                <m:sty m:val="p"/>
-              </m:rPr>
-              <m:t>⊤</m:t>
-            </m:r>
-          </m:sup>
-        </m:sSup>
+        </m:acc>
+        <m:r>
+          <m:rPr>
+            <m:sty m:val="p"/>
+          </m:rPr>
+          <m:t>⋅</m:t>
+        </m:r>
         <m:acc>
           <m:accPr>
             <m:chr m:val="̃"/>
@@ -37984,28 +37972,22 @@
                     </m:rPr>
                     <m:t>(</m:t>
                   </m:r>
-                  <m:sSup>
+                  <m:acc>
+                    <m:accPr>
+                      <m:chr m:val="̃"/>
+                    </m:accPr>
                     <m:e>
-                      <m:acc>
-                        <m:accPr>
-                          <m:chr m:val="̃"/>
-                        </m:accPr>
-                        <m:e>
-                          <m:r>
-                            <m:t>β</m:t>
-                          </m:r>
-                        </m:e>
-                      </m:acc>
+                      <m:r>
+                        <m:t>β</m:t>
+                      </m:r>
                     </m:e>
-                    <m:sup>
-                      <m:r>
-                        <m:rPr>
-                          <m:sty m:val="p"/>
-                        </m:rPr>
-                        <m:t>⊤</m:t>
-                      </m:r>
-                    </m:sup>
-                  </m:sSup>
+                  </m:acc>
+                  <m:r>
+                    <m:rPr>
+                      <m:sty m:val="p"/>
+                    </m:rPr>
+                    <m:t>⋅</m:t>
+                  </m:r>
                   <m:acc>
                     <m:accPr>
                       <m:chr m:val="̃"/>
@@ -38249,6 +38231,84 @@
                 </m:rPr>
                 <m:t>(</m:t>
               </m:r>
+              <m:acc>
+                <m:accPr>
+                  <m:chr m:val="̃"/>
+                </m:accPr>
+                <m:e>
+                  <m:r>
+                    <m:t>β</m:t>
+                  </m:r>
+                </m:e>
+              </m:acc>
+              <m:r>
+                <m:rPr>
+                  <m:sty m:val="p"/>
+                </m:rPr>
+                <m:t>⋅</m:t>
+              </m:r>
+              <m:acc>
+                <m:accPr>
+                  <m:chr m:val="̃"/>
+                </m:accPr>
+                <m:e>
+                  <m:r>
+                    <m:t>β</m:t>
+                  </m:r>
+                </m:e>
+              </m:acc>
+              <m:r>
+                <m:rPr>
+                  <m:sty m:val="p"/>
+                </m:rPr>
+                <m:t>)</m:t>
+              </m:r>
+              <m:r>
+                <m:t>&amp;</m:t>
+              </m:r>
+              <m:r>
+                <m:rPr>
+                  <m:sty m:val="p"/>
+                </m:rPr>
+                <m:t>=</m:t>
+              </m:r>
+              <m:f>
+                <m:fPr>
+                  <m:type m:val="bar"/>
+                </m:fPr>
+                <m:num>
+                  <m:r>
+                    <m:rPr>
+                      <m:sty m:val="p"/>
+                    </m:rPr>
+                    <m:t>∂</m:t>
+                  </m:r>
+                </m:num>
+                <m:den>
+                  <m:r>
+                    <m:rPr>
+                      <m:sty m:val="p"/>
+                    </m:rPr>
+                    <m:t>∂</m:t>
+                  </m:r>
+                  <m:acc>
+                    <m:accPr>
+                      <m:chr m:val="̃"/>
+                    </m:accPr>
+                    <m:e>
+                      <m:r>
+                        <m:t>β</m:t>
+                      </m:r>
+                    </m:e>
+                  </m:acc>
+                </m:den>
+              </m:f>
+              <m:r>
+                <m:rPr>
+                  <m:sty m:val="p"/>
+                </m:rPr>
+                <m:t>(</m:t>
+              </m:r>
               <m:sSup>
                 <m:e>
                   <m:acc>
@@ -38271,90 +38331,6 @@
                   </m:r>
                 </m:sup>
               </m:sSup>
-              <m:acc>
-                <m:accPr>
-                  <m:chr m:val="̃"/>
-                </m:accPr>
-                <m:e>
-                  <m:r>
-                    <m:t>β</m:t>
-                  </m:r>
-                </m:e>
-              </m:acc>
-              <m:r>
-                <m:rPr>
-                  <m:sty m:val="p"/>
-                </m:rPr>
-                <m:t>)</m:t>
-              </m:r>
-              <m:r>
-                <m:t>&amp;</m:t>
-              </m:r>
-              <m:r>
-                <m:rPr>
-                  <m:sty m:val="p"/>
-                </m:rPr>
-                <m:t>=</m:t>
-              </m:r>
-              <m:f>
-                <m:fPr>
-                  <m:type m:val="bar"/>
-                </m:fPr>
-                <m:num>
-                  <m:r>
-                    <m:rPr>
-                      <m:sty m:val="p"/>
-                    </m:rPr>
-                    <m:t>∂</m:t>
-                  </m:r>
-                </m:num>
-                <m:den>
-                  <m:r>
-                    <m:rPr>
-                      <m:sty m:val="p"/>
-                    </m:rPr>
-                    <m:t>∂</m:t>
-                  </m:r>
-                  <m:acc>
-                    <m:accPr>
-                      <m:chr m:val="̃"/>
-                    </m:accPr>
-                    <m:e>
-                      <m:r>
-                        <m:t>β</m:t>
-                      </m:r>
-                    </m:e>
-                  </m:acc>
-                </m:den>
-              </m:f>
-              <m:r>
-                <m:rPr>
-                  <m:sty m:val="p"/>
-                </m:rPr>
-                <m:t>(</m:t>
-              </m:r>
-              <m:sSup>
-                <m:e>
-                  <m:acc>
-                    <m:accPr>
-                      <m:chr m:val="̃"/>
-                    </m:accPr>
-                    <m:e>
-                      <m:r>
-                        <m:t>β</m:t>
-                      </m:r>
-                    </m:e>
-                  </m:acc>
-                </m:e>
-                <m:sup>
-                  <m:r>
-                    <m:rPr>
-                      <m:sty m:val="p"/>
-                    </m:rPr>
-                    <m:t>⊤</m:t>
-                  </m:r>
-                </m:sup>
-              </m:sSup>
               <m:sSub>
                 <m:e>
                   <m:r>
@@ -38738,28 +38714,6 @@
           </m:rPr>
           <m:t>(</m:t>
         </m:r>
-        <m:sSup>
-          <m:e>
-            <m:acc>
-              <m:accPr>
-                <m:chr m:val="̃"/>
-              </m:accPr>
-              <m:e>
-                <m:r>
-                  <m:t>β</m:t>
-                </m:r>
-              </m:e>
-            </m:acc>
-          </m:e>
-          <m:sup>
-            <m:r>
-              <m:rPr>
-                <m:sty m:val="p"/>
-              </m:rPr>
-              <m:t>⊤</m:t>
-            </m:r>
-          </m:sup>
-        </m:sSup>
         <m:acc>
           <m:accPr>
             <m:chr m:val="̃"/>
@@ -38774,16 +38728,7 @@
           <m:rPr>
             <m:sty m:val="p"/>
           </m:rPr>
-          <m:t>)</m:t>
-        </m:r>
-        <m:r>
-          <m:rPr>
-            <m:sty m:val="p"/>
-          </m:rPr>
-          <m:t>=</m:t>
-        </m:r>
-        <m:r>
-          <m:t>2</m:t>
+          <m:t>⋅</m:t>
         </m:r>
         <m:acc>
           <m:accPr>
@@ -38795,22 +38740,11 @@
             </m:r>
           </m:e>
         </m:acc>
-      </m:oMath>
-      <w:r>
-        <w:t xml:space="preserve">.</w:t>
-      </w:r>
-      <w:r>
-        <w:t xml:space="preserve"> </w:t>
-      </w:r>
-      <w:r>
-        <w:t xml:space="preserve">For example, with</w:t>
-      </w:r>
-      <w:r>
-        <w:t xml:space="preserve"> </w:t>
-      </w:r>
-      <m:oMath>
-        <m:r>
-          <m:t>p</m:t>
+        <m:r>
+          <m:rPr>
+            <m:sty m:val="p"/>
+          </m:rPr>
+          <m:t>)</m:t>
         </m:r>
         <m:r>
           <m:rPr>
@@ -38819,19 +38753,8 @@
           <m:t>=</m:t>
         </m:r>
         <m:r>
-          <m:t>1</m:t>
-        </m:r>
-      </m:oMath>
-      <w:r>
-        <w:t xml:space="preserve"> </w:t>
-      </w:r>
-      <w:r>
-        <w:t xml:space="preserve">and</w:t>
-      </w:r>
-      <w:r>
-        <w:t xml:space="preserve"> </w:t>
-      </w:r>
-      <m:oMath>
+          <m:t>2</m:t>
+        </m:r>
         <m:acc>
           <m:accPr>
             <m:chr m:val="̃"/>
@@ -38842,6 +38765,53 @@
             </m:r>
           </m:e>
         </m:acc>
+      </m:oMath>
+      <w:r>
+        <w:t xml:space="preserve">.</w:t>
+      </w:r>
+      <w:r>
+        <w:t xml:space="preserve"> </w:t>
+      </w:r>
+      <w:r>
+        <w:t xml:space="preserve">For example, with</w:t>
+      </w:r>
+      <w:r>
+        <w:t xml:space="preserve"> </w:t>
+      </w:r>
+      <m:oMath>
+        <m:r>
+          <m:t>p</m:t>
+        </m:r>
+        <m:r>
+          <m:rPr>
+            <m:sty m:val="p"/>
+          </m:rPr>
+          <m:t>=</m:t>
+        </m:r>
+        <m:r>
+          <m:t>1</m:t>
+        </m:r>
+      </m:oMath>
+      <w:r>
+        <w:t xml:space="preserve"> </w:t>
+      </w:r>
+      <w:r>
+        <w:t xml:space="preserve">and</w:t>
+      </w:r>
+      <w:r>
+        <w:t xml:space="preserve"> </w:t>
+      </w:r>
+      <m:oMath>
+        <m:acc>
+          <m:accPr>
+            <m:chr m:val="̃"/>
+          </m:accPr>
+          <m:e>
+            <m:r>
+              <m:t>β</m:t>
+            </m:r>
+          </m:e>
+        </m:acc>
         <m:r>
           <m:rPr>
             <m:sty m:val="p"/>
@@ -38880,28 +38850,22 @@
         <w:t xml:space="preserve"> </w:t>
       </w:r>
       <m:oMath>
-        <m:sSup>
+        <m:acc>
+          <m:accPr>
+            <m:chr m:val="̃"/>
+          </m:accPr>
           <m:e>
-            <m:acc>
-              <m:accPr>
-                <m:chr m:val="̃"/>
-              </m:accPr>
-              <m:e>
-                <m:r>
-                  <m:t>β</m:t>
-                </m:r>
-              </m:e>
-            </m:acc>
+            <m:r>
+              <m:t>β</m:t>
+            </m:r>
           </m:e>
-          <m:sup>
-            <m:r>
-              <m:rPr>
-                <m:sty m:val="p"/>
-              </m:rPr>
-              <m:t>⊤</m:t>
-            </m:r>
-          </m:sup>
-        </m:sSup>
+        </m:acc>
+        <m:r>
+          <m:rPr>
+            <m:sty m:val="p"/>
+          </m:rPr>
+          <m:t>⋅</m:t>
+        </m:r>
         <m:acc>
           <m:accPr>
             <m:chr m:val="̃"/>
@@ -39089,28 +39053,22 @@
         <w:t xml:space="preserve"> </w:t>
       </w:r>
       <m:oMath>
-        <m:sSup>
+        <m:acc>
+          <m:accPr>
+            <m:chr m:val="̃"/>
+          </m:accPr>
           <m:e>
-            <m:acc>
-              <m:accPr>
-                <m:chr m:val="̃"/>
-              </m:accPr>
-              <m:e>
-                <m:r>
-                  <m:t>β</m:t>
-                </m:r>
-              </m:e>
-            </m:acc>
+            <m:r>
+              <m:t>β</m:t>
+            </m:r>
           </m:e>
-          <m:sup>
-            <m:r>
-              <m:rPr>
-                <m:sty m:val="p"/>
-              </m:rPr>
-              <m:t>⊤</m:t>
-            </m:r>
-          </m:sup>
-        </m:sSup>
+        </m:acc>
+        <m:r>
+          <m:rPr>
+            <m:sty m:val="p"/>
+          </m:rPr>
+          <m:t>⋅</m:t>
+        </m:r>
         <m:acc>
           <m:accPr>
             <m:chr m:val="̃"/>
@@ -39242,28 +39200,22 @@
                     </m:rPr>
                     <m:t>(</m:t>
                   </m:r>
-                  <m:sSup>
+                  <m:acc>
+                    <m:accPr>
+                      <m:chr m:val="̃"/>
+                    </m:accPr>
                     <m:e>
-                      <m:acc>
-                        <m:accPr>
-                          <m:chr m:val="̃"/>
-                        </m:accPr>
-                        <m:e>
-                          <m:r>
-                            <m:t>β</m:t>
-                          </m:r>
-                        </m:e>
-                      </m:acc>
+                      <m:r>
+                        <m:t>β</m:t>
+                      </m:r>
                     </m:e>
-                    <m:sup>
-                      <m:r>
-                        <m:rPr>
-                          <m:sty m:val="p"/>
-                        </m:rPr>
-                        <m:t>⊤</m:t>
-                      </m:r>
-                    </m:sup>
-                  </m:sSup>
+                  </m:acc>
+                  <m:r>
+                    <m:rPr>
+                      <m:sty m:val="p"/>
+                    </m:rPr>
+                    <m:t>⋅</m:t>
+                  </m:r>
                   <m:acc>
                     <m:accPr>
                       <m:chr m:val="̃"/>

</xml_diff>

<commit_message>
Deploying to gh-pages from @ Morrison-Lab/mds@71834acbbd0f0bf28e228a479b5cf7a03a734aef 🚀
</commit_message>
<xml_diff>
--- a/vector-calculus.docx
+++ b/vector-calculus.docx
@@ -15,7 +15,7 @@
         <w:pStyle w:val="Date"/>
       </w:pPr>
       <w:r>
-        <w:t xml:space="preserve">Last modified: 2026-10-09 02:04:21 (PDT)</w:t>
+        <w:t xml:space="preserve">Last modified: 2026-10-09 09:50:57 (PDT)</w:t>
       </w:r>
     </w:p>
     <w:p>
@@ -31078,7 +31078,7 @@
       </w:r>
       <m:oMath>
         <m:r>
-          <m:t>ℓ</m:t>
+          <m:t>k</m:t>
         </m:r>
         <m:r>
           <m:rPr>
@@ -31393,7 +31393,7 @@
                 <m:t>×</m:t>
               </m:r>
               <m:r>
-                <m:t>ℓ</m:t>
+                <m:t>k</m:t>
               </m:r>
             </m:lim>
           </m:limLow>
@@ -31582,7 +31582,7 @@
                 <m:t>×</m:t>
               </m:r>
               <m:r>
-                <m:t>ℓ</m:t>
+                <m:t>k</m:t>
               </m:r>
             </m:lim>
           </m:limLow>
@@ -31629,7 +31629,7 @@
       </w:r>
       <m:oMath>
         <m:r>
-          <m:t>ℓ</m:t>
+          <m:t>k</m:t>
         </m:r>
         <m:r>
           <m:rPr>

</xml_diff>